<commit_message>
Mise a jour du papier en-tete (haut de page complet, espace signature vierge)
Co-authored-by: hosongwen2014-netizen <307543822+hosongwen2014-netizen@users.noreply.github.com>
</commit_message>
<xml_diff>
--- a/PAPIER_EN_TETE_18_EITHING.docx
+++ b/PAPIER_EN_TETE_18_EITHING.docx
@@ -33,9 +33,18 @@
             </w:r>
             <w:r>
               <w:rPr>
+                <w:b/>
+                <w:color w:val="0E2C43"/>
+                <w:sz w:val="19"/>
+              </w:rPr>
+              <w:t>Raison sociale : 18 EITHING SARL</w:t>
+              <w:br/>
+            </w:r>
+            <w:r>
+              <w:rPr>
                 <w:i/>
                 <w:color w:val="C99B5B"/>
-                <w:sz w:val="19"/>
+                <w:sz w:val="18"/>
               </w:rPr>
               <w:t>Conseil • Logistique • Recyclage &amp; Valorisation Industrielle</w:t>
             </w:r>
@@ -57,7 +66,7 @@
               </w:rPr>
               <w:t>Siège social : Kétou, Département du Plateau, Bénin</w:t>
               <w:br/>
-              <w:t>Tél / WhatsApp : +229 44 66 95 87</w:t>
+              <w:t>Téléphone / WhatsApp : +229 44 66 95 87</w:t>
               <w:br/>
               <w:t>Email : contact@18eithing.bj</w:t>
               <w:br/>
@@ -134,76 +143,29 @@
     </w:p>
     <w:p>
       <w:pPr>
-        <w:spacing w:after="600"/>
+        <w:spacing w:before="600" w:after="80"/>
+        <w:jc w:val="right"/>
       </w:pPr>
+      <w:r>
+        <w:rPr>
+          <w:b/>
+          <w:color w:val="0E2C43"/>
+        </w:rPr>
+        <w:t>Signature et Cachet Officiel :</w:t>
+        <w:br/>
+        <w:br/>
+        <w:br/>
+        <w:br/>
+      </w:r>
+      <w:r>
+        <w:rPr>
+          <w:i/>
+          <w:color w:val="666666"/>
+          <w:sz w:val="18"/>
+        </w:rPr>
+        <w:t>(Emplacement réservé au cachet et à la signature)</w:t>
+      </w:r>
     </w:p>
-    <w:tbl>
-      <w:tblPr>
-        <w:tblW w:type="auto" w:w="0"/>
-        <w:jc w:val="center"/>
-        <w:tblLook w:firstColumn="1" w:firstRow="1" w:lastColumn="0" w:lastRow="0" w:noHBand="0" w:noVBand="1" w:val="04A0"/>
-      </w:tblPr>
-      <w:tblGrid>
-        <w:gridCol w:w="5112"/>
-        <w:gridCol w:w="5112"/>
-      </w:tblGrid>
-      <w:tr>
-        <w:tc>
-          <w:tcPr>
-            <w:tcW w:type="dxa" w:w="5112"/>
-          </w:tcPr>
-          <w:p>
-            <w:pPr>
-              <w:jc w:val="center"/>
-            </w:pPr>
-            <w:r>
-              <w:rPr>
-                <w:b/>
-                <w:color w:val="0E2C43"/>
-              </w:rPr>
-              <w:t>M. Hubert C. TOKPANOU</w:t>
-              <w:br/>
-            </w:r>
-            <w:r>
-              <w:rPr>
-                <w:i/>
-                <w:sz w:val="19"/>
-              </w:rPr>
-              <w:t>Directeur Général</w:t>
-              <w:br/>
-              <w:t>Pôle Finance, Supply Chain &amp; Logistique</w:t>
-            </w:r>
-          </w:p>
-        </w:tc>
-        <w:tc>
-          <w:tcPr>
-            <w:tcW w:type="dxa" w:w="5112"/>
-          </w:tcPr>
-          <w:p>
-            <w:pPr>
-              <w:jc w:val="center"/>
-            </w:pPr>
-            <w:r>
-              <w:rPr>
-                <w:b/>
-                <w:color w:val="0E2C43"/>
-              </w:rPr>
-              <w:t>M. Pedro S. KPONON</w:t>
-              <w:br/>
-            </w:r>
-            <w:r>
-              <w:rPr>
-                <w:i/>
-                <w:sz w:val="19"/>
-              </w:rPr>
-              <w:t>Gérant</w:t>
-              <w:br/>
-              <w:t>Pôle SST, Ergonomie &amp; Santé au Travail</w:t>
-            </w:r>
-          </w:p>
-        </w:tc>
-      </w:tr>
-    </w:tbl>
     <w:p>
       <w:pPr>
         <w:spacing w:before="800" w:after="120"/>

</xml_diff>